<commit_message>
Se modifica documento type
</commit_message>
<xml_diff>
--- a/src/assets/PlantillaUno.docx
+++ b/src/assets/PlantillaUno.docx
@@ -170,8 +170,11 @@
     </w:p>
     <w:p>
       <w:pPr>
+        <w:spacing w:after="0"/>
         <w:jc w:val="both"/>
         <w:rPr>
+          <w:b/>
+          <w:bCs/>
           <w:lang w:val="es-ES"/>
         </w:rPr>
       </w:pPr>
@@ -183,6 +186,8 @@
       </w:r>
       <w:r>
         <w:rPr>
+          <w:b/>
+          <w:bCs/>
           <w:lang w:val="es-ES"/>
         </w:rPr>
         <w:t>{</w:t>
@@ -190,12 +195,16 @@
       <w:proofErr w:type="spellStart"/>
       <w:r>
         <w:rPr>
+          <w:b/>
+          <w:bCs/>
           <w:lang w:val="es-ES"/>
         </w:rPr>
         <w:t>E</w:t>
       </w:r>
       <w:r>
         <w:rPr>
+          <w:b/>
+          <w:bCs/>
           <w:lang w:val="es-ES"/>
         </w:rPr>
         <w:t>tNom</w:t>
@@ -203,6 +212,8 @@
       <w:proofErr w:type="spellEnd"/>
       <w:r>
         <w:rPr>
+          <w:b/>
+          <w:bCs/>
           <w:lang w:val="es-ES"/>
         </w:rPr>
         <w:t>}</w:t>
@@ -210,8 +221,11 @@
     </w:p>
     <w:p>
       <w:pPr>
+        <w:spacing w:after="0"/>
         <w:jc w:val="both"/>
         <w:rPr>
+          <w:b/>
+          <w:bCs/>
           <w:lang w:val="es-ES"/>
         </w:rPr>
       </w:pPr>
@@ -226,6 +240,8 @@
       </w:r>
       <w:r>
         <w:rPr>
+          <w:b/>
+          <w:bCs/>
           <w:lang w:val="es-ES"/>
         </w:rPr>
         <w:t>{</w:t>
@@ -233,6 +249,8 @@
       <w:proofErr w:type="spellStart"/>
       <w:r>
         <w:rPr>
+          <w:b/>
+          <w:bCs/>
           <w:lang w:val="es-ES"/>
         </w:rPr>
         <w:t>EtNa</w:t>
@@ -240,6 +258,8 @@
       <w:proofErr w:type="spellEnd"/>
       <w:r>
         <w:rPr>
+          <w:b/>
+          <w:bCs/>
           <w:lang w:val="es-ES"/>
         </w:rPr>
         <w:t>}</w:t>
@@ -247,8 +267,11 @@
     </w:p>
     <w:p>
       <w:pPr>
+        <w:spacing w:after="0"/>
         <w:jc w:val="both"/>
         <w:rPr>
+          <w:b/>
+          <w:bCs/>
           <w:lang w:val="es-ES"/>
         </w:rPr>
       </w:pPr>
@@ -266,48 +289,64 @@
       </w:r>
       <w:r>
         <w:rPr>
+          <w:b/>
+          <w:bCs/>
           <w:lang w:val="es-ES"/>
         </w:rPr>
         <w:t>{</w:t>
       </w:r>
       <w:r>
         <w:rPr>
+          <w:b/>
+          <w:bCs/>
           <w:lang w:val="es-ES"/>
         </w:rPr>
         <w:t>#</w:t>
       </w:r>
       <w:r>
         <w:rPr>
+          <w:b/>
+          <w:bCs/>
           <w:lang w:val="es-ES"/>
         </w:rPr>
         <w:t>EtId</w:t>
       </w:r>
       <w:r>
         <w:rPr>
+          <w:b/>
+          <w:bCs/>
           <w:lang w:val="es-ES"/>
         </w:rPr>
         <w:t>}</w:t>
       </w:r>
       <w:r>
         <w:rPr>
+          <w:b/>
+          <w:bCs/>
           <w:lang w:val="es-ES"/>
         </w:rPr>
         <w:t xml:space="preserve"> </w:t>
       </w:r>
       <w:r>
         <w:rPr>
+          <w:b/>
+          <w:bCs/>
           <w:lang w:val="es-ES"/>
         </w:rPr>
         <w:t>{idioma} – {nivel}</w:t>
       </w:r>
       <w:r>
         <w:rPr>
+          <w:b/>
+          <w:bCs/>
           <w:lang w:val="es-ES"/>
         </w:rPr>
         <w:t xml:space="preserve"> </w:t>
       </w:r>
       <w:r>
         <w:rPr>
+          <w:b/>
+          <w:bCs/>
           <w:lang w:val="es-ES"/>
         </w:rPr>
         <w:t>{/</w:t>
@@ -315,6 +354,8 @@
       <w:proofErr w:type="spellStart"/>
       <w:r>
         <w:rPr>
+          <w:b/>
+          <w:bCs/>
           <w:lang w:val="es-ES"/>
         </w:rPr>
         <w:t>EtId</w:t>
@@ -322,6 +363,8 @@
       <w:proofErr w:type="spellEnd"/>
       <w:r>
         <w:rPr>
+          <w:b/>
+          <w:bCs/>
           <w:lang w:val="es-ES"/>
         </w:rPr>
         <w:t>}</w:t>
@@ -329,8 +372,11 @@
     </w:p>
     <w:p>
       <w:pPr>
+        <w:spacing w:after="0"/>
         <w:jc w:val="both"/>
         <w:rPr>
+          <w:b/>
+          <w:bCs/>
           <w:lang w:val="es-ES"/>
         </w:rPr>
       </w:pPr>
@@ -342,6 +388,8 @@
       </w:r>
       <w:r>
         <w:rPr>
+          <w:b/>
+          <w:bCs/>
           <w:lang w:val="es-ES"/>
         </w:rPr>
         <w:t>{</w:t>
@@ -349,6 +397,8 @@
       <w:proofErr w:type="spellStart"/>
       <w:r>
         <w:rPr>
+          <w:b/>
+          <w:bCs/>
           <w:lang w:val="es-ES"/>
         </w:rPr>
         <w:t>EtRe</w:t>
@@ -356,6 +406,8 @@
       <w:proofErr w:type="spellEnd"/>
       <w:r>
         <w:rPr>
+          <w:b/>
+          <w:bCs/>
           <w:lang w:val="es-ES"/>
         </w:rPr>
         <w:t>}</w:t>
@@ -376,6 +428,8 @@
       </w:r>
       <w:r>
         <w:rPr>
+          <w:b/>
+          <w:bCs/>
           <w:lang w:val="es-ES"/>
         </w:rPr>
         <w:t>{</w:t>
@@ -383,6 +437,8 @@
       <w:proofErr w:type="spellStart"/>
       <w:r>
         <w:rPr>
+          <w:b/>
+          <w:bCs/>
           <w:u w:val="single"/>
           <w:lang w:val="es-ES"/>
         </w:rPr>
@@ -391,6 +447,8 @@
       <w:proofErr w:type="spellEnd"/>
       <w:r>
         <w:rPr>
+          <w:b/>
+          <w:bCs/>
           <w:lang w:val="es-ES"/>
         </w:rPr>
         <w:t>}</w:t>
@@ -437,6 +495,7 @@
     </w:p>
     <w:p>
       <w:pPr>
+        <w:spacing w:after="0"/>
         <w:jc w:val="both"/>
       </w:pPr>
       <w:r>
@@ -457,13 +516,18 @@
     </w:p>
     <w:p>
       <w:pPr>
+        <w:spacing w:after="0"/>
         <w:jc w:val="both"/>
         <w:rPr>
-          <w:lang w:val="es-ES"/>
-        </w:rPr>
-      </w:pPr>
-      <w:r>
-        <w:rPr>
+          <w:b/>
+          <w:bCs/>
+          <w:lang w:val="es-ES"/>
+        </w:rPr>
+      </w:pPr>
+      <w:r>
+        <w:rPr>
+          <w:b/>
+          <w:bCs/>
           <w:lang w:val="es-ES"/>
         </w:rPr>
         <w:t>{universidad}</w:t>
@@ -471,6 +535,7 @@
     </w:p>
     <w:p>
       <w:pPr>
+        <w:spacing w:after="0"/>
         <w:jc w:val="both"/>
         <w:rPr>
           <w:b/>
@@ -495,6 +560,7 @@
     </w:p>
     <w:p>
       <w:pPr>
+        <w:spacing w:after="0"/>
         <w:jc w:val="both"/>
         <w:rPr>
           <w:b/>
@@ -546,10 +612,13 @@
         </w:rPr>
       </w:pPr>
       <w:r>
-        <w:rPr>
-          <w:lang w:val="es-ES"/>
-        </w:rPr>
-        <w:t>Generación:</w:t>
+        <w:t>Generación</w:t>
+      </w:r>
+      <w:r>
+        <w:rPr>
+          <w:lang w:val="es-ES"/>
+        </w:rPr>
+        <w:t>:</w:t>
       </w:r>
       <w:r>
         <w:rPr>
@@ -580,6 +649,7 @@
     </w:p>
     <w:p>
       <w:pPr>
+        <w:spacing w:after="0"/>
         <w:jc w:val="both"/>
         <w:rPr>
           <w:lang w:val="es-ES"/>
@@ -1154,7 +1224,7 @@
     </w:tbl>
     <w:p>
       <w:pPr>
-        <w:spacing w:before="240"/>
+        <w:jc w:val="both"/>
         <w:rPr>
           <w:color w:val="000000" w:themeColor="text1"/>
           <w:lang w:val="es-ES"/>
@@ -1170,453 +1240,462 @@
       <w:proofErr w:type="spellStart"/>
       <w:r>
         <w:rPr>
+          <w:lang w:val="es-ES"/>
+        </w:rPr>
+        <w:t>tieneSkills</w:t>
+      </w:r>
+      <w:proofErr w:type="spellEnd"/>
+      <w:r>
+        <w:rPr>
           <w:color w:val="000000" w:themeColor="text1"/>
           <w:lang w:val="es-ES"/>
         </w:rPr>
-        <w:t>tieneSkills</w:t>
+        <w:t>}</w:t>
+      </w:r>
+    </w:p>
+    <w:p>
+      <w:pPr>
+        <w:spacing w:before="240" w:after="0"/>
+        <w:rPr>
+          <w:b/>
+          <w:bCs/>
+          <w:color w:val="0070C0"/>
+          <w:lang w:val="es-ES"/>
+        </w:rPr>
+      </w:pPr>
+      <w:r>
+        <w:rPr>
+          <w:b/>
+          <w:bCs/>
+          <w:color w:val="0070C0"/>
+          <w:lang w:val="es-ES"/>
+        </w:rPr>
+        <w:t>EXPERIENCIA LABORAL</w:t>
+      </w:r>
+    </w:p>
+    <w:p>
+      <w:pPr>
+        <w:spacing w:after="0"/>
+        <w:rPr>
+          <w:b/>
+          <w:bCs/>
+          <w:color w:val="000000" w:themeColor="text1"/>
+          <w:lang w:val="es-ES"/>
+        </w:rPr>
+      </w:pPr>
+      <w:r>
+        <w:rPr>
+          <w:b/>
+          <w:bCs/>
+          <w:color w:val="000000" w:themeColor="text1"/>
+        </w:rPr>
+        <w:t>‾‾‾‾‾‾‾‾‾‾‾‾‾‾‾‾‾‾‾‾‾‾‾‾‾‾‾‾‾‾‾‾‾‾‾‾‾‾‾‾‾‾‾‾‾‾‾‾‾‾‾‾‾‾‾‾‾‾‾‾‾‾‾‾‾‾‾‾‾‾‾‾‾‾‾‾‾‾‾‾‾‾‾‾‾‾‾‾‾‾‾‾‾‾‾‾‾</w:t>
+      </w:r>
+    </w:p>
+    <w:p>
+      <w:pPr>
+        <w:spacing w:after="0"/>
+        <w:jc w:val="both"/>
+      </w:pPr>
+      <w:r>
+        <w:rPr>
+          <w:lang w:val="es-ES"/>
+        </w:rPr>
+        <w:t>{#</w:t>
+      </w:r>
+      <w:r>
+        <w:t>experiencias</w:t>
+      </w:r>
+      <w:r>
+        <w:rPr>
+          <w:lang w:val="es-ES"/>
+        </w:rPr>
+        <w:t>}</w:t>
+      </w:r>
+    </w:p>
+    <w:p>
+      <w:pPr>
+        <w:spacing w:after="0"/>
+        <w:jc w:val="both"/>
+        <w:rPr>
+          <w:b/>
+          <w:bCs/>
+          <w:lang w:val="es-ES"/>
+        </w:rPr>
+      </w:pPr>
+      <w:r>
+        <w:rPr>
+          <w:lang w:val="es-ES"/>
+        </w:rPr>
+        <w:t>Puesto</w:t>
+      </w:r>
+      <w:r>
+        <w:rPr>
+          <w:lang w:val="es-ES"/>
+        </w:rPr>
+        <w:t>:</w:t>
+      </w:r>
+      <w:r>
+        <w:rPr>
+          <w:b/>
+          <w:bCs/>
+          <w:lang w:val="es-ES"/>
+        </w:rPr>
+        <w:t xml:space="preserve"> {</w:t>
+      </w:r>
+      <w:r>
+        <w:rPr>
+          <w:b/>
+          <w:bCs/>
+          <w:lang w:val="es-ES"/>
+        </w:rPr>
+        <w:t>puesto</w:t>
+      </w:r>
+      <w:r>
+        <w:rPr>
+          <w:b/>
+          <w:bCs/>
+          <w:lang w:val="es-ES"/>
+        </w:rPr>
+        <w:t>}</w:t>
+      </w:r>
+    </w:p>
+    <w:p>
+      <w:pPr>
+        <w:spacing w:after="0"/>
+        <w:jc w:val="both"/>
+        <w:rPr>
+          <w:b/>
+          <w:bCs/>
+          <w:u w:val="single"/>
+          <w:lang w:val="es-ES"/>
+        </w:rPr>
+      </w:pPr>
+      <w:r>
+        <w:rPr>
+          <w:lang w:val="es-ES"/>
+        </w:rPr>
+        <w:t>Empresa</w:t>
+      </w:r>
+      <w:r>
+        <w:rPr>
+          <w:lang w:val="es-ES"/>
+        </w:rPr>
+        <w:t>:</w:t>
+      </w:r>
+      <w:r>
+        <w:rPr>
+          <w:b/>
+          <w:bCs/>
+          <w:lang w:val="es-ES"/>
+        </w:rPr>
+        <w:t xml:space="preserve"> {</w:t>
+      </w:r>
+      <w:r>
+        <w:rPr>
+          <w:b/>
+          <w:bCs/>
+          <w:lang w:val="es-ES"/>
+        </w:rPr>
+        <w:t>empresa</w:t>
+      </w:r>
+      <w:r>
+        <w:rPr>
+          <w:b/>
+          <w:bCs/>
+          <w:lang w:val="es-ES"/>
+        </w:rPr>
+        <w:t>}</w:t>
+      </w:r>
+    </w:p>
+    <w:p>
+      <w:pPr>
+        <w:spacing w:after="0"/>
+        <w:jc w:val="both"/>
+        <w:rPr>
+          <w:b/>
+          <w:bCs/>
+          <w:lang w:val="es-ES"/>
+        </w:rPr>
+      </w:pPr>
+      <w:r>
+        <w:rPr>
+          <w:lang w:val="es-ES"/>
+        </w:rPr>
+        <w:lastRenderedPageBreak/>
+        <w:t>Fecha</w:t>
+      </w:r>
+      <w:r>
+        <w:rPr>
+          <w:lang w:val="es-ES"/>
+        </w:rPr>
+        <w:t>:</w:t>
+      </w:r>
+      <w:r>
+        <w:rPr>
+          <w:b/>
+          <w:bCs/>
+          <w:lang w:val="es-ES"/>
+        </w:rPr>
+        <w:t xml:space="preserve"> {</w:t>
+      </w:r>
+      <w:r>
+        <w:rPr>
+          <w:b/>
+          <w:bCs/>
+          <w:lang w:val="es-ES"/>
+        </w:rPr>
+        <w:t>periodo</w:t>
+      </w:r>
+      <w:r>
+        <w:rPr>
+          <w:b/>
+          <w:bCs/>
+          <w:lang w:val="es-ES"/>
+        </w:rPr>
+        <w:t>}</w:t>
+      </w:r>
+    </w:p>
+    <w:p>
+      <w:pPr>
+        <w:jc w:val="both"/>
+        <w:rPr>
+          <w:lang w:val="es-ES"/>
+        </w:rPr>
+      </w:pPr>
+      <w:r>
+        <w:rPr>
+          <w:lang w:val="es-ES"/>
+        </w:rPr>
+        <w:t>{</w:t>
+      </w:r>
+      <w:proofErr w:type="spellStart"/>
+      <w:r>
+        <w:t>descripcion</w:t>
       </w:r>
       <w:proofErr w:type="spellEnd"/>
       <w:r>
         <w:rPr>
+          <w:lang w:val="es-ES"/>
+        </w:rPr>
+        <w:t>}</w:t>
+      </w:r>
+    </w:p>
+    <w:p>
+      <w:pPr>
+        <w:spacing w:after="0"/>
+        <w:jc w:val="both"/>
+        <w:rPr>
+          <w:lang w:val="es-ES"/>
+        </w:rPr>
+      </w:pPr>
+      <w:r>
+        <w:rPr>
+          <w:lang w:val="es-ES"/>
+        </w:rPr>
+        <w:t>{/</w:t>
+      </w:r>
+      <w:r>
+        <w:t>experiencias</w:t>
+      </w:r>
+      <w:r>
+        <w:rPr>
+          <w:lang w:val="es-ES"/>
+        </w:rPr>
+        <w:t>}</w:t>
+      </w:r>
+    </w:p>
+    <w:p>
+      <w:pPr>
+        <w:jc w:val="both"/>
+        <w:rPr>
+          <w:lang w:val="es-ES"/>
+        </w:rPr>
+      </w:pPr>
+      <w:r>
+        <w:rPr>
+          <w:lang w:val="es-ES"/>
+        </w:rPr>
+        <w:t>{#tieneCursos}</w:t>
+      </w:r>
+    </w:p>
+    <w:p>
+      <w:pPr>
+        <w:spacing w:after="0"/>
+        <w:rPr>
+          <w:b/>
+          <w:bCs/>
+          <w:color w:val="0070C0"/>
+          <w:lang w:val="es-ES"/>
+        </w:rPr>
+      </w:pPr>
+      <w:r>
+        <w:rPr>
+          <w:b/>
+          <w:bCs/>
+          <w:color w:val="0070C0"/>
+          <w:lang w:val="es-ES"/>
+        </w:rPr>
+        <w:t>OTROS ESTUDIOS</w:t>
+      </w:r>
+    </w:p>
+    <w:p>
+      <w:pPr>
+        <w:spacing w:after="0"/>
+        <w:rPr>
+          <w:b/>
+          <w:bCs/>
           <w:color w:val="000000" w:themeColor="text1"/>
           <w:lang w:val="es-ES"/>
         </w:rPr>
+      </w:pPr>
+      <w:r>
+        <w:rPr>
+          <w:b/>
+          <w:bCs/>
+          <w:color w:val="000000" w:themeColor="text1"/>
+        </w:rPr>
+        <w:t>‾‾‾‾‾‾‾‾‾‾‾‾‾‾‾‾‾‾‾‾‾‾‾‾‾‾‾‾‾‾‾‾‾‾‾‾‾‾‾‾‾‾‾‾‾‾‾‾‾‾‾‾‾‾‾‾‾‾‾‾‾‾‾‾‾‾‾‾‾‾‾‾‾‾‾‾‾‾‾‾‾‾‾‾‾‾‾‾‾‾‾‾‾‾‾‾‾</w:t>
+      </w:r>
+    </w:p>
+    <w:p>
+      <w:pPr>
+        <w:spacing w:after="0"/>
+        <w:jc w:val="both"/>
+      </w:pPr>
+      <w:r>
+        <w:t>{#cursos}</w:t>
+      </w:r>
+    </w:p>
+    <w:p>
+      <w:pPr>
+        <w:spacing w:after="0"/>
+        <w:jc w:val="both"/>
+        <w:rPr>
+          <w:b/>
+          <w:bCs/>
+        </w:rPr>
+      </w:pPr>
+      <w:r>
+        <w:rPr>
+          <w:b/>
+          <w:bCs/>
+        </w:rPr>
+        <w:t>{nombre}</w:t>
+      </w:r>
+    </w:p>
+    <w:p>
+      <w:pPr>
+        <w:spacing w:after="0"/>
+        <w:jc w:val="both"/>
+        <w:rPr>
+          <w:b/>
+          <w:bCs/>
+        </w:rPr>
+      </w:pPr>
+      <w:r>
+        <w:rPr>
+          <w:b/>
+          <w:bCs/>
+        </w:rPr>
+        <w:t xml:space="preserve">Organización: </w:t>
+      </w:r>
+      <w:r>
+        <w:rPr>
+          <w:b/>
+          <w:bCs/>
+        </w:rPr>
+        <w:t>{</w:t>
+      </w:r>
+      <w:proofErr w:type="spellStart"/>
+      <w:r>
+        <w:rPr>
+          <w:b/>
+          <w:bCs/>
+        </w:rPr>
+        <w:t>organizacion</w:t>
+      </w:r>
+      <w:proofErr w:type="spellEnd"/>
+      <w:r>
+        <w:rPr>
+          <w:b/>
+          <w:bCs/>
+        </w:rPr>
         <w:t>}</w:t>
       </w:r>
     </w:p>
     <w:p>
       <w:pPr>
-        <w:spacing w:before="240" w:after="0"/>
-        <w:rPr>
-          <w:b/>
-          <w:bCs/>
-          <w:color w:val="0070C0"/>
-          <w:lang w:val="es-ES"/>
-        </w:rPr>
-      </w:pPr>
-      <w:r>
-        <w:rPr>
-          <w:b/>
-          <w:bCs/>
-          <w:color w:val="0070C0"/>
-          <w:lang w:val="es-ES"/>
-        </w:rPr>
-        <w:lastRenderedPageBreak/>
-        <w:t>EXPERIENCIA LABORAL</w:t>
-      </w:r>
-    </w:p>
-    <w:p>
-      <w:pPr>
         <w:spacing w:after="0"/>
-        <w:rPr>
-          <w:b/>
-          <w:bCs/>
-          <w:color w:val="000000" w:themeColor="text1"/>
-          <w:lang w:val="es-ES"/>
-        </w:rPr>
-      </w:pPr>
-      <w:r>
-        <w:rPr>
-          <w:b/>
-          <w:bCs/>
-          <w:color w:val="000000" w:themeColor="text1"/>
-        </w:rPr>
-        <w:t>‾‾‾‾‾‾‾‾‾‾‾‾‾‾‾‾‾‾‾‾‾‾‾‾‾‾‾‾‾‾‾‾‾‾‾‾‾‾‾‾‾‾‾‾‾‾‾‾‾‾‾‾‾‾‾‾‾‾‾‾‾‾‾‾‾‾‾‾‾‾‾‾‾‾‾‾‾‾‾‾‾‾‾‾‾‾‾‾‾‾‾‾‾‾‾‾‾</w:t>
-      </w:r>
-    </w:p>
-    <w:p>
-      <w:pPr>
         <w:jc w:val="both"/>
       </w:pPr>
       <w:r>
-        <w:rPr>
-          <w:lang w:val="es-ES"/>
-        </w:rPr>
-        <w:t>{#</w:t>
-      </w:r>
-      <w:r>
-        <w:t>experiencias</w:t>
-      </w:r>
-      <w:r>
-        <w:rPr>
-          <w:lang w:val="es-ES"/>
-        </w:rPr>
+        <w:t>{</w:t>
+      </w:r>
+      <w:r>
+        <w:t>periodo</w:t>
+      </w:r>
+      <w:r>
         <w:t>}</w:t>
       </w:r>
     </w:p>
     <w:p>
       <w:pPr>
+        <w:spacing w:after="0"/>
         <w:jc w:val="both"/>
-        <w:rPr>
-          <w:b/>
-          <w:bCs/>
-          <w:lang w:val="es-ES"/>
-        </w:rPr>
-      </w:pPr>
-      <w:r>
-        <w:rPr>
-          <w:lang w:val="es-ES"/>
-        </w:rPr>
-        <w:t>Puesto</w:t>
-      </w:r>
-      <w:r>
-        <w:rPr>
-          <w:lang w:val="es-ES"/>
-        </w:rPr>
-        <w:t>:</w:t>
-      </w:r>
-      <w:r>
-        <w:rPr>
-          <w:b/>
-          <w:bCs/>
-          <w:lang w:val="es-ES"/>
-        </w:rPr>
-        <w:t xml:space="preserve"> {</w:t>
-      </w:r>
-      <w:r>
-        <w:rPr>
-          <w:b/>
-          <w:bCs/>
-          <w:lang w:val="es-ES"/>
-        </w:rPr>
-        <w:t>puesto</w:t>
-      </w:r>
-      <w:r>
-        <w:rPr>
-          <w:b/>
-          <w:bCs/>
-          <w:lang w:val="es-ES"/>
-        </w:rPr>
+      </w:pPr>
+      <w:r>
+        <w:t xml:space="preserve">Descripción: </w:t>
+      </w:r>
+      <w:r>
+        <w:t>{</w:t>
+      </w:r>
+      <w:proofErr w:type="spellStart"/>
+      <w:r>
+        <w:t>descripcion</w:t>
+      </w:r>
+      <w:proofErr w:type="spellEnd"/>
+      <w:r>
         <w:t>}</w:t>
       </w:r>
     </w:p>
     <w:p>
       <w:pPr>
+        <w:spacing w:after="0"/>
         <w:jc w:val="both"/>
-        <w:rPr>
-          <w:b/>
-          <w:bCs/>
-          <w:u w:val="single"/>
-          <w:lang w:val="es-ES"/>
-        </w:rPr>
-      </w:pPr>
-      <w:r>
-        <w:rPr>
-          <w:lang w:val="es-ES"/>
-        </w:rPr>
-        <w:t>Empresa</w:t>
-      </w:r>
-      <w:r>
-        <w:rPr>
-          <w:lang w:val="es-ES"/>
-        </w:rPr>
-        <w:t>:</w:t>
-      </w:r>
-      <w:r>
-        <w:rPr>
-          <w:b/>
-          <w:bCs/>
-          <w:lang w:val="es-ES"/>
-        </w:rPr>
-        <w:t xml:space="preserve"> {</w:t>
-      </w:r>
-      <w:r>
-        <w:rPr>
-          <w:b/>
-          <w:bCs/>
-          <w:lang w:val="es-ES"/>
-        </w:rPr>
-        <w:t>empresa</w:t>
-      </w:r>
-      <w:r>
-        <w:rPr>
-          <w:b/>
-          <w:bCs/>
-          <w:lang w:val="es-ES"/>
-        </w:rPr>
+      </w:pPr>
+      <w:r>
+        <w:t>Entidad: {entidad}</w:t>
+      </w:r>
+    </w:p>
+    <w:p>
+      <w:pPr>
+        <w:jc w:val="both"/>
+      </w:pPr>
+      <w:r>
+        <w:t>Tiempo de estudios: {</w:t>
+      </w:r>
+      <w:proofErr w:type="spellStart"/>
+      <w:r>
+        <w:t>tiempoEstudio</w:t>
+      </w:r>
+      <w:proofErr w:type="spellEnd"/>
+      <w:r>
         <w:t>}</w:t>
       </w:r>
     </w:p>
     <w:p>
       <w:pPr>
+        <w:spacing w:after="0"/>
         <w:jc w:val="both"/>
-        <w:rPr>
-          <w:b/>
-          <w:bCs/>
-          <w:lang w:val="es-ES"/>
-        </w:rPr>
-      </w:pPr>
-      <w:r>
-        <w:rPr>
-          <w:lang w:val="es-ES"/>
-        </w:rPr>
-        <w:t>Fecha</w:t>
-      </w:r>
-      <w:r>
-        <w:rPr>
-          <w:lang w:val="es-ES"/>
-        </w:rPr>
-        <w:t>:</w:t>
-      </w:r>
-      <w:r>
-        <w:rPr>
-          <w:b/>
-          <w:bCs/>
-          <w:lang w:val="es-ES"/>
-        </w:rPr>
-        <w:t xml:space="preserve"> {</w:t>
-      </w:r>
-      <w:r>
-        <w:rPr>
-          <w:b/>
-          <w:bCs/>
-          <w:lang w:val="es-ES"/>
-        </w:rPr>
-        <w:t>periodo</w:t>
-      </w:r>
-      <w:r>
-        <w:rPr>
-          <w:b/>
-          <w:bCs/>
-          <w:lang w:val="es-ES"/>
-        </w:rPr>
-        <w:t>}</w:t>
-      </w:r>
-    </w:p>
-    <w:p>
-      <w:pPr>
-        <w:jc w:val="both"/>
-        <w:rPr>
-          <w:lang w:val="es-ES"/>
-        </w:rPr>
-      </w:pPr>
-      <w:r>
-        <w:rPr>
-          <w:lang w:val="es-ES"/>
-        </w:rPr>
-        <w:t>{</w:t>
-      </w:r>
-      <w:proofErr w:type="spellStart"/>
-      <w:r>
-        <w:rPr>
-          <w:lang w:val="es-ES"/>
-        </w:rPr>
-        <w:t>descripcion</w:t>
-      </w:r>
-      <w:proofErr w:type="spellEnd"/>
-      <w:r>
-        <w:rPr>
-          <w:lang w:val="es-ES"/>
-        </w:rPr>
-        <w:t>}</w:t>
-      </w:r>
-    </w:p>
-    <w:p>
-      <w:pPr>
-        <w:jc w:val="both"/>
-        <w:rPr>
-          <w:lang w:val="es-ES"/>
-        </w:rPr>
-      </w:pPr>
-      <w:r>
-        <w:rPr>
-          <w:lang w:val="es-ES"/>
-        </w:rPr>
-        <w:t>{/</w:t>
-      </w:r>
-      <w:r>
-        <w:t>experiencias</w:t>
-      </w:r>
-      <w:r>
-        <w:rPr>
-          <w:lang w:val="es-ES"/>
-        </w:rPr>
-        <w:t>}</w:t>
-      </w:r>
-    </w:p>
-    <w:p>
-      <w:pPr>
-        <w:jc w:val="both"/>
-        <w:rPr>
-          <w:lang w:val="es-ES"/>
-        </w:rPr>
-      </w:pPr>
-      <w:r>
-        <w:rPr>
-          <w:lang w:val="es-ES"/>
-        </w:rPr>
-        <w:t>{#tieneCursos}</w:t>
+      </w:pPr>
+      <w:r>
+        <w:t>{/cursos}</w:t>
       </w:r>
     </w:p>
     <w:p>
       <w:pPr>
         <w:spacing w:after="0"/>
-        <w:rPr>
-          <w:b/>
-          <w:bCs/>
-          <w:color w:val="0070C0"/>
-          <w:lang w:val="es-ES"/>
-        </w:rPr>
-      </w:pPr>
-      <w:r>
-        <w:rPr>
-          <w:b/>
-          <w:bCs/>
-          <w:color w:val="0070C0"/>
-          <w:lang w:val="es-ES"/>
-        </w:rPr>
-        <w:t>OTROS ESTUDIOS</w:t>
-      </w:r>
-    </w:p>
-    <w:p>
-      <w:pPr>
-        <w:spacing w:after="0"/>
-        <w:rPr>
-          <w:b/>
-          <w:bCs/>
-          <w:color w:val="000000" w:themeColor="text1"/>
-          <w:lang w:val="es-ES"/>
-        </w:rPr>
-      </w:pPr>
-      <w:r>
-        <w:rPr>
-          <w:b/>
-          <w:bCs/>
-          <w:color w:val="000000" w:themeColor="text1"/>
-        </w:rPr>
-        <w:t>‾‾‾‾‾‾‾‾‾‾‾‾‾‾‾‾‾‾‾‾‾‾‾‾‾‾‾‾‾‾‾‾‾‾‾‾‾‾‾‾‾‾‾‾‾‾‾‾‾‾‾‾‾‾‾‾‾‾‾‾‾‾‾‾‾‾‾‾‾‾‾‾‾‾‾‾‾‾‾‾‾‾‾‾‾‾‾‾‾‾‾‾‾‾‾‾‾</w:t>
-      </w:r>
-    </w:p>
-    <w:p>
-      <w:pPr>
-        <w:jc w:val="both"/>
-      </w:pPr>
-      <w:r>
-        <w:t>{#cursos}</w:t>
-      </w:r>
-    </w:p>
-    <w:p>
-      <w:pPr>
-        <w:jc w:val="both"/>
-        <w:rPr>
-          <w:b/>
-          <w:bCs/>
-        </w:rPr>
-      </w:pPr>
-      <w:r>
-        <w:rPr>
-          <w:b/>
-          <w:bCs/>
-        </w:rPr>
-        <w:t>{nombre}</w:t>
-      </w:r>
-    </w:p>
-    <w:p>
-      <w:pPr>
-        <w:jc w:val="both"/>
-        <w:rPr>
-          <w:b/>
-          <w:bCs/>
-        </w:rPr>
-      </w:pPr>
-      <w:r>
-        <w:rPr>
-          <w:b/>
-          <w:bCs/>
-        </w:rPr>
-        <w:t xml:space="preserve">Organización: </w:t>
-      </w:r>
-      <w:r>
-        <w:rPr>
-          <w:b/>
-          <w:bCs/>
-        </w:rPr>
-        <w:t>{</w:t>
-      </w:r>
-      <w:proofErr w:type="spellStart"/>
-      <w:r>
-        <w:rPr>
-          <w:b/>
-          <w:bCs/>
-        </w:rPr>
-        <w:t>organizacion</w:t>
-      </w:r>
-      <w:proofErr w:type="spellEnd"/>
-      <w:r>
-        <w:rPr>
-          <w:b/>
-          <w:bCs/>
-        </w:rPr>
-        <w:t>}</w:t>
-      </w:r>
-    </w:p>
-    <w:p>
-      <w:pPr>
-        <w:jc w:val="both"/>
-      </w:pPr>
-      <w:r>
-        <w:t>{</w:t>
-      </w:r>
-      <w:r>
-        <w:t>periodo</w:t>
-      </w:r>
-      <w:r>
-        <w:t>}</w:t>
-      </w:r>
-    </w:p>
-    <w:p>
-      <w:pPr>
-        <w:jc w:val="both"/>
-      </w:pPr>
-      <w:r>
-        <w:t xml:space="preserve">Descripción: </w:t>
-      </w:r>
-      <w:r>
-        <w:t>{</w:t>
-      </w:r>
-      <w:proofErr w:type="spellStart"/>
-      <w:r>
-        <w:t>descripcion</w:t>
-      </w:r>
-      <w:proofErr w:type="spellEnd"/>
-      <w:r>
-        <w:t>}</w:t>
-      </w:r>
-    </w:p>
-    <w:p>
-      <w:pPr>
-        <w:jc w:val="both"/>
-      </w:pPr>
-      <w:r>
-        <w:t>Entidad: {entidad}</w:t>
-      </w:r>
-    </w:p>
-    <w:p>
-      <w:pPr>
-        <w:jc w:val="both"/>
-      </w:pPr>
-      <w:r>
-        <w:t>Tiempo de estudios: {</w:t>
-      </w:r>
-      <w:proofErr w:type="spellStart"/>
-      <w:r>
-        <w:t>tiempoEstudio</w:t>
-      </w:r>
-      <w:proofErr w:type="spellEnd"/>
-      <w:r>
-        <w:t>}</w:t>
-      </w:r>
-    </w:p>
-    <w:p>
-      <w:pPr>
-        <w:jc w:val="both"/>
-      </w:pPr>
-      <w:r>
-        <w:t>{/cursos}</w:t>
-      </w:r>
-    </w:p>
-    <w:p>
-      <w:pPr>
         <w:jc w:val="both"/>
       </w:pPr>
       <w:r>

</xml_diff>

<commit_message>
Se modifica docs v2
</commit_message>
<xml_diff>
--- a/src/assets/PlantillaUno.docx
+++ b/src/assets/PlantillaUno.docx
@@ -1056,7 +1056,6 @@
           </w:tcPr>
           <w:p>
             <w:pPr>
-              <w:keepNext/>
               <w:rPr>
                 <w:lang w:val="es-ES"/>
               </w:rPr>
@@ -1111,7 +1110,6 @@
           </w:tcPr>
           <w:p>
             <w:pPr>
-              <w:keepNext/>
               <w:rPr>
                 <w:lang w:val="es-ES"/>
               </w:rPr>
@@ -1157,7 +1155,6 @@
           </w:tcPr>
           <w:p>
             <w:pPr>
-              <w:keepNext/>
               <w:rPr>
                 <w:lang w:val="es-ES"/>
               </w:rPr>
@@ -1203,7 +1200,6 @@
           </w:tcPr>
           <w:p>
             <w:pPr>
-              <w:keepNext/>
               <w:rPr>
                 <w:lang w:val="es-ES"/>
               </w:rPr>
@@ -1286,8 +1282,7 @@
     </w:p>
     <w:p>
       <w:pPr>
-        <w:keepNext/>
-        <w:spacing w:before="240" w:after="0"/>
+        <w:spacing w:after="0"/>
         <w:rPr>
           <w:b/>
           <w:bCs/>
@@ -1295,15 +1290,6 @@
           <w:lang w:val="es-ES"/>
         </w:rPr>
       </w:pPr>
-      <w:r>
-        <w:rPr>
-          <w:b/>
-          <w:bCs/>
-          <w:color w:val="0070C0"/>
-          <w:lang w:val="es-ES"/>
-        </w:rPr>
-        <w:t>EXPERIENCIA LABORAL</w:t>
-      </w:r>
     </w:p>
     <w:p>
       <w:pPr>
@@ -1312,6 +1298,28 @@
         <w:rPr>
           <w:b/>
           <w:bCs/>
+          <w:color w:val="0070C0"/>
+          <w:lang w:val="es-ES"/>
+        </w:rPr>
+      </w:pPr>
+      <w:r>
+        <w:rPr>
+          <w:b/>
+          <w:bCs/>
+          <w:color w:val="0070C0"/>
+          <w:lang w:val="es-ES"/>
+        </w:rPr>
+        <w:lastRenderedPageBreak/>
+        <w:t>EXPERIENCIA LABORAL</w:t>
+      </w:r>
+    </w:p>
+    <w:p>
+      <w:pPr>
+        <w:keepNext/>
+        <w:spacing w:after="0"/>
+        <w:rPr>
+          <w:b/>
+          <w:bCs/>
           <w:color w:val="000000" w:themeColor="text1"/>
           <w:lang w:val="es-ES"/>
         </w:rPr>
@@ -1327,6 +1335,7 @@
     </w:p>
     <w:p>
       <w:pPr>
+        <w:keepNext/>
         <w:spacing w:after="0"/>
         <w:jc w:val="both"/>
       </w:pPr>
@@ -1348,6 +1357,7 @@
     </w:p>
     <w:p>
       <w:pPr>
+        <w:keepNext/>
         <w:spacing w:after="0"/>
         <w:jc w:val="both"/>
         <w:rPr>
@@ -1408,7 +1418,6 @@
         <w:rPr>
           <w:lang w:val="es-ES"/>
         </w:rPr>
-        <w:lastRenderedPageBreak/>
         <w:t>Empresa</w:t>
       </w:r>
       <w:r>
@@ -1555,7 +1564,6 @@
     </w:p>
     <w:p>
       <w:pPr>
-        <w:keepNext/>
         <w:spacing w:after="0"/>
         <w:rPr>
           <w:b/>
@@ -1576,7 +1584,6 @@
     </w:p>
     <w:p>
       <w:pPr>
-        <w:keepNext/>
         <w:spacing w:after="0"/>
         <w:rPr>
           <w:b/>
@@ -1762,7 +1769,6 @@
     </w:p>
     <w:p>
       <w:pPr>
-        <w:keepNext/>
         <w:spacing w:after="0"/>
         <w:rPr>
           <w:b/>
@@ -1783,7 +1789,6 @@
     </w:p>
     <w:p>
       <w:pPr>
-        <w:keepNext/>
         <w:spacing w:after="0"/>
         <w:rPr>
           <w:b/>

</xml_diff>